<commit_message>
Replace human evaluation materials with revised supplied archive
</commit_message>
<xml_diff>
--- a/human-evaluation/Rater_Guide_short.docx
+++ b/human-evaluation/Rater_Guide_short.docx
@@ -60,12 +60,6 @@
         <w:gridCol w:w="9360"/>
       </w:tblGrid>
       <w:tr>
-        <w:tblPrEx>
-          <w:tblCellMar>
-            <w:top w:w="0" w:type="dxa"/>
-            <w:bottom w:w="0" w:type="dxa"/>
-          </w:tblCellMar>
-        </w:tblPrEx>
         <w:tc>
           <w:tcPr>
             <w:tcW w:w="9360" w:type="dxa"/>
@@ -196,12 +190,6 @@
         <w:gridCol w:w="2000"/>
       </w:tblGrid>
       <w:tr>
-        <w:tblPrEx>
-          <w:tblCellMar>
-            <w:top w:w="0" w:type="dxa"/>
-            <w:bottom w:w="0" w:type="dxa"/>
-          </w:tblCellMar>
-        </w:tblPrEx>
         <w:trPr>
           <w:tblHeader/>
         </w:trPr>
@@ -339,12 +327,6 @@
         </w:tc>
       </w:tr>
       <w:tr>
-        <w:tblPrEx>
-          <w:tblCellMar>
-            <w:top w:w="0" w:type="dxa"/>
-            <w:bottom w:w="0" w:type="dxa"/>
-          </w:tblCellMar>
-        </w:tblPrEx>
         <w:trPr>
           <w:cantSplit/>
         </w:trPr>
@@ -431,7 +413,15 @@
                 <w:sz w:val="18"/>
                 <w:szCs w:val="18"/>
               </w:rPr>
-              <w:t xml:space="preserve">6 scenes + 1 </w:t>
+              <w:t>3</w:t>
+            </w:r>
+            <w:r>
+              <w:rPr>
+                <w:rFonts w:ascii="Arial" w:hAnsi="Arial" w:cs="Arial"/>
+                <w:sz w:val="18"/>
+                <w:szCs w:val="18"/>
+              </w:rPr>
+              <w:t xml:space="preserve"> scenes + 1 </w:t>
             </w:r>
             <w:proofErr w:type="gramStart"/>
             <w:r>
@@ -470,18 +460,20 @@
                 <w:sz w:val="18"/>
                 <w:szCs w:val="18"/>
               </w:rPr>
-              <w:t>about 1 hour</w:t>
+              <w:t xml:space="preserve">about </w:t>
+            </w:r>
+            <w:r>
+              <w:rPr>
+                <w:rFonts w:ascii="Arial" w:hAnsi="Arial" w:cs="Arial"/>
+                <w:sz w:val="18"/>
+                <w:szCs w:val="18"/>
+              </w:rPr>
+              <w:t>30 minutes</w:t>
             </w:r>
           </w:p>
         </w:tc>
       </w:tr>
       <w:tr>
-        <w:tblPrEx>
-          <w:tblCellMar>
-            <w:top w:w="0" w:type="dxa"/>
-            <w:bottom w:w="0" w:type="dxa"/>
-          </w:tblCellMar>
-        </w:tblPrEx>
         <w:trPr>
           <w:cantSplit/>
         </w:trPr>
@@ -584,7 +576,31 @@
                 <w:sz w:val="18"/>
                 <w:szCs w:val="18"/>
               </w:rPr>
-              <w:t>55 scenes</w:t>
+              <w:t>5</w:t>
+            </w:r>
+            <w:r>
+              <w:rPr>
+                <w:rFonts w:ascii="Arial" w:hAnsi="Arial" w:cs="Arial"/>
+                <w:sz w:val="18"/>
+                <w:szCs w:val="18"/>
+              </w:rPr>
+              <w:t>0</w:t>
+            </w:r>
+            <w:r>
+              <w:rPr>
+                <w:rFonts w:ascii="Arial" w:hAnsi="Arial" w:cs="Arial"/>
+                <w:sz w:val="18"/>
+                <w:szCs w:val="18"/>
+              </w:rPr>
+              <w:t xml:space="preserve"> scenes</w:t>
+            </w:r>
+            <w:r>
+              <w:rPr>
+                <w:rFonts w:ascii="Arial" w:hAnsi="Arial" w:cs="Arial"/>
+                <w:sz w:val="18"/>
+                <w:szCs w:val="18"/>
+              </w:rPr>
+              <w:t xml:space="preserve"> (25 pairs)</w:t>
             </w:r>
           </w:p>
         </w:tc>
@@ -613,18 +629,12 @@
                 <w:sz w:val="18"/>
                 <w:szCs w:val="18"/>
               </w:rPr>
-              <w:t>about 4 hours, 3 sittings</w:t>
+              <w:t>about 4 hours</w:t>
             </w:r>
           </w:p>
         </w:tc>
       </w:tr>
       <w:tr>
-        <w:tblPrEx>
-          <w:tblCellMar>
-            <w:top w:w="0" w:type="dxa"/>
-            <w:bottom w:w="0" w:type="dxa"/>
-          </w:tblCellMar>
-        </w:tblPrEx>
         <w:trPr>
           <w:cantSplit/>
         </w:trPr>
@@ -711,7 +721,31 @@
                 <w:sz w:val="18"/>
                 <w:szCs w:val="18"/>
               </w:rPr>
-              <w:t>20 sequences</w:t>
+              <w:t>5</w:t>
+            </w:r>
+            <w:r>
+              <w:rPr>
+                <w:rFonts w:ascii="Arial" w:hAnsi="Arial" w:cs="Arial"/>
+                <w:sz w:val="18"/>
+                <w:szCs w:val="18"/>
+              </w:rPr>
+              <w:t>0</w:t>
+            </w:r>
+            <w:r>
+              <w:rPr>
+                <w:rFonts w:ascii="Arial" w:hAnsi="Arial" w:cs="Arial"/>
+                <w:sz w:val="18"/>
+                <w:szCs w:val="18"/>
+              </w:rPr>
+              <w:t xml:space="preserve"> scenes</w:t>
+            </w:r>
+            <w:r>
+              <w:rPr>
+                <w:rFonts w:ascii="Arial" w:hAnsi="Arial" w:cs="Arial"/>
+                <w:sz w:val="18"/>
+                <w:szCs w:val="18"/>
+              </w:rPr>
+              <w:t xml:space="preserve"> (25 pairs)</w:t>
             </w:r>
           </w:p>
         </w:tc>
@@ -740,7 +774,23 @@
                 <w:sz w:val="18"/>
                 <w:szCs w:val="18"/>
               </w:rPr>
-              <w:t>about 5 hours, 4 sittings</w:t>
+              <w:t xml:space="preserve">about </w:t>
+            </w:r>
+            <w:r>
+              <w:rPr>
+                <w:rFonts w:ascii="Arial" w:hAnsi="Arial" w:cs="Arial"/>
+                <w:sz w:val="18"/>
+                <w:szCs w:val="18"/>
+              </w:rPr>
+              <w:t>4</w:t>
+            </w:r>
+            <w:r>
+              <w:rPr>
+                <w:rFonts w:ascii="Arial" w:hAnsi="Arial" w:cs="Arial"/>
+                <w:sz w:val="18"/>
+                <w:szCs w:val="18"/>
+              </w:rPr>
+              <w:t xml:space="preserve"> hours</w:t>
             </w:r>
           </w:p>
         </w:tc>
@@ -878,12 +928,6 @@
         <w:gridCol w:w="1560"/>
       </w:tblGrid>
       <w:tr>
-        <w:tblPrEx>
-          <w:tblCellMar>
-            <w:top w:w="0" w:type="dxa"/>
-            <w:bottom w:w="0" w:type="dxa"/>
-          </w:tblCellMar>
-        </w:tblPrEx>
         <w:trPr>
           <w:tblHeader/>
         </w:trPr>
@@ -1131,12 +1175,6 @@
         </w:tc>
       </w:tr>
       <w:tr>
-        <w:tblPrEx>
-          <w:tblCellMar>
-            <w:top w:w="0" w:type="dxa"/>
-            <w:bottom w:w="0" w:type="dxa"/>
-          </w:tblCellMar>
-        </w:tblPrEx>
         <w:trPr>
           <w:cantSplit/>
         </w:trPr>
@@ -1318,12 +1356,6 @@
         </w:tc>
       </w:tr>
       <w:tr>
-        <w:tblPrEx>
-          <w:tblCellMar>
-            <w:top w:w="0" w:type="dxa"/>
-            <w:bottom w:w="0" w:type="dxa"/>
-          </w:tblCellMar>
-        </w:tblPrEx>
         <w:trPr>
           <w:cantSplit/>
         </w:trPr>
@@ -1505,12 +1537,6 @@
         </w:tc>
       </w:tr>
       <w:tr>
-        <w:tblPrEx>
-          <w:tblCellMar>
-            <w:top w:w="0" w:type="dxa"/>
-            <w:bottom w:w="0" w:type="dxa"/>
-          </w:tblCellMar>
-        </w:tblPrEx>
         <w:trPr>
           <w:cantSplit/>
         </w:trPr>
@@ -1692,12 +1718,6 @@
         </w:tc>
       </w:tr>
       <w:tr>
-        <w:tblPrEx>
-          <w:tblCellMar>
-            <w:top w:w="0" w:type="dxa"/>
-            <w:bottom w:w="0" w:type="dxa"/>
-          </w:tblCellMar>
-        </w:tblPrEx>
         <w:trPr>
           <w:cantSplit/>
         </w:trPr>
@@ -1879,12 +1899,6 @@
         </w:tc>
       </w:tr>
       <w:tr>
-        <w:tblPrEx>
-          <w:tblCellMar>
-            <w:top w:w="0" w:type="dxa"/>
-            <w:bottom w:w="0" w:type="dxa"/>
-          </w:tblCellMar>
-        </w:tblPrEx>
         <w:trPr>
           <w:cantSplit/>
         </w:trPr>
@@ -2214,6 +2228,18 @@
         <w:spacing w:before="120" w:after="120"/>
         <w:rPr>
           <w:rFonts w:ascii="Arial" w:hAnsi="Arial" w:cs="Arial"/>
+          <w:b/>
+          <w:bCs/>
+          <w:sz w:val="18"/>
+          <w:szCs w:val="18"/>
+        </w:rPr>
+      </w:pPr>
+    </w:p>
+    <w:p>
+      <w:pPr>
+        <w:spacing w:before="120" w:after="120"/>
+        <w:rPr>
+          <w:rFonts w:ascii="Arial" w:hAnsi="Arial" w:cs="Arial"/>
           <w:sz w:val="18"/>
           <w:szCs w:val="18"/>
         </w:rPr>
@@ -2256,6 +2282,19 @@
         </w:rPr>
         <w:t xml:space="preserve"> For each of the five scenes, score the focus dimension from 0 to 10 for Version A and for Version B, using the Part A table.</w:t>
       </w:r>
+    </w:p>
+    <w:p>
+      <w:pPr>
+        <w:keepNext/>
+        <w:spacing w:before="120" w:after="60"/>
+        <w:rPr>
+          <w:rFonts w:ascii="Arial" w:hAnsi="Arial" w:cs="Arial"/>
+          <w:b/>
+          <w:bCs/>
+          <w:sz w:val="18"/>
+          <w:szCs w:val="18"/>
+        </w:rPr>
+      </w:pPr>
     </w:p>
     <w:p>
       <w:pPr>
@@ -2330,12 +2369,6 @@
         <w:gridCol w:w="2660"/>
       </w:tblGrid>
       <w:tr>
-        <w:tblPrEx>
-          <w:tblCellMar>
-            <w:top w:w="0" w:type="dxa"/>
-            <w:bottom w:w="0" w:type="dxa"/>
-          </w:tblCellMar>
-        </w:tblPrEx>
         <w:trPr>
           <w:tblHeader/>
         </w:trPr>
@@ -2462,12 +2495,6 @@
         </w:tc>
       </w:tr>
       <w:tr>
-        <w:tblPrEx>
-          <w:tblCellMar>
-            <w:top w:w="0" w:type="dxa"/>
-            <w:bottom w:w="0" w:type="dxa"/>
-          </w:tblCellMar>
-        </w:tblPrEx>
         <w:trPr>
           <w:cantSplit/>
         </w:trPr>
@@ -2591,12 +2618,6 @@
         </w:tc>
       </w:tr>
       <w:tr>
-        <w:tblPrEx>
-          <w:tblCellMar>
-            <w:top w:w="0" w:type="dxa"/>
-            <w:bottom w:w="0" w:type="dxa"/>
-          </w:tblCellMar>
-        </w:tblPrEx>
         <w:trPr>
           <w:cantSplit/>
         </w:trPr>
@@ -2720,12 +2741,6 @@
         </w:tc>
       </w:tr>
       <w:tr>
-        <w:tblPrEx>
-          <w:tblCellMar>
-            <w:top w:w="0" w:type="dxa"/>
-            <w:bottom w:w="0" w:type="dxa"/>
-          </w:tblCellMar>
-        </w:tblPrEx>
         <w:trPr>
           <w:cantSplit/>
         </w:trPr>
@@ -2922,12 +2937,6 @@
         <w:gridCol w:w="2660"/>
       </w:tblGrid>
       <w:tr>
-        <w:tblPrEx>
-          <w:tblCellMar>
-            <w:top w:w="0" w:type="dxa"/>
-            <w:bottom w:w="0" w:type="dxa"/>
-          </w:tblCellMar>
-        </w:tblPrEx>
         <w:trPr>
           <w:tblHeader/>
         </w:trPr>
@@ -3065,12 +3074,6 @@
         </w:tc>
       </w:tr>
       <w:tr>
-        <w:tblPrEx>
-          <w:tblCellMar>
-            <w:top w:w="0" w:type="dxa"/>
-            <w:bottom w:w="0" w:type="dxa"/>
-          </w:tblCellMar>
-        </w:tblPrEx>
         <w:trPr>
           <w:cantSplit/>
         </w:trPr>
@@ -3194,12 +3197,6 @@
         </w:tc>
       </w:tr>
       <w:tr>
-        <w:tblPrEx>
-          <w:tblCellMar>
-            <w:top w:w="0" w:type="dxa"/>
-            <w:bottom w:w="0" w:type="dxa"/>
-          </w:tblCellMar>
-        </w:tblPrEx>
         <w:trPr>
           <w:cantSplit/>
         </w:trPr>
@@ -3323,12 +3320,6 @@
         </w:tc>
       </w:tr>
       <w:tr>
-        <w:tblPrEx>
-          <w:tblCellMar>
-            <w:top w:w="0" w:type="dxa"/>
-            <w:bottom w:w="0" w:type="dxa"/>
-          </w:tblCellMar>
-        </w:tblPrEx>
         <w:trPr>
           <w:cantSplit/>
         </w:trPr>
@@ -3522,175 +3513,6 @@
           <w:szCs w:val="18"/>
         </w:rPr>
         <w:t>Use the focus dimension only in Step 1. Do not try to guess which version is the original. Length on its own is not a fault.</w:t>
-      </w:r>
-    </w:p>
-    <w:p>
-      <w:pPr>
-        <w:pStyle w:val="Heading1"/>
-        <w:rPr>
-          <w:rFonts w:ascii="Arial" w:hAnsi="Arial" w:cs="Arial"/>
-          <w:sz w:val="18"/>
-          <w:szCs w:val="18"/>
-        </w:rPr>
-      </w:pPr>
-      <w:r>
-        <w:rPr>
-          <w:rFonts w:ascii="Arial" w:hAnsi="Arial" w:cs="Arial"/>
-          <w:sz w:val="18"/>
-          <w:szCs w:val="18"/>
-        </w:rPr>
-        <w:t>Filling in the answer sheet</w:t>
-      </w:r>
-    </w:p>
-    <w:p>
-      <w:pPr>
-        <w:pStyle w:val="ListParagraph"/>
-        <w:numPr>
-          <w:ilvl w:val="0"/>
-          <w:numId w:val="2"/>
-        </w:numPr>
-        <w:spacing w:after="60"/>
-        <w:rPr>
-          <w:rFonts w:ascii="Arial" w:hAnsi="Arial" w:cs="Arial"/>
-          <w:sz w:val="18"/>
-          <w:szCs w:val="18"/>
-        </w:rPr>
-      </w:pPr>
-      <w:r>
-        <w:rPr>
-          <w:rFonts w:ascii="Arial" w:hAnsi="Arial" w:cs="Arial"/>
-          <w:sz w:val="18"/>
-          <w:szCs w:val="18"/>
-        </w:rPr>
-        <w:t xml:space="preserve">Each rater receives one Excel workbook. Fill only the </w:t>
-      </w:r>
-      <w:r>
-        <w:rPr>
-          <w:rFonts w:ascii="Arial" w:hAnsi="Arial" w:cs="Arial"/>
-          <w:b/>
-          <w:bCs/>
-          <w:sz w:val="18"/>
-          <w:szCs w:val="18"/>
-        </w:rPr>
-        <w:t>yellow</w:t>
-      </w:r>
-      <w:r>
-        <w:rPr>
-          <w:rFonts w:ascii="Arial" w:hAnsi="Arial" w:cs="Arial"/>
-          <w:sz w:val="18"/>
-          <w:szCs w:val="18"/>
-        </w:rPr>
-        <w:t xml:space="preserve"> cells; grey cells are filled in by the organizers.</w:t>
-      </w:r>
-    </w:p>
-    <w:p>
-      <w:pPr>
-        <w:pStyle w:val="ListParagraph"/>
-        <w:numPr>
-          <w:ilvl w:val="0"/>
-          <w:numId w:val="2"/>
-        </w:numPr>
-        <w:spacing w:after="60"/>
-        <w:rPr>
-          <w:rFonts w:ascii="Arial" w:hAnsi="Arial" w:cs="Arial"/>
-          <w:sz w:val="18"/>
-          <w:szCs w:val="18"/>
-        </w:rPr>
-      </w:pPr>
-      <w:r>
-        <w:rPr>
-          <w:rFonts w:ascii="Arial" w:hAnsi="Arial" w:cs="Arial"/>
-          <w:sz w:val="18"/>
-          <w:szCs w:val="18"/>
-        </w:rPr>
-        <w:t>Go row by row in the order given; it matches your reading packet.</w:t>
-      </w:r>
-    </w:p>
-    <w:p>
-      <w:pPr>
-        <w:pStyle w:val="ListParagraph"/>
-        <w:numPr>
-          <w:ilvl w:val="0"/>
-          <w:numId w:val="2"/>
-        </w:numPr>
-        <w:spacing w:after="60"/>
-        <w:rPr>
-          <w:rFonts w:ascii="Arial" w:hAnsi="Arial" w:cs="Arial"/>
-          <w:sz w:val="18"/>
-          <w:szCs w:val="18"/>
-        </w:rPr>
-      </w:pPr>
-      <w:r>
-        <w:rPr>
-          <w:rFonts w:ascii="Arial" w:hAnsi="Arial" w:cs="Arial"/>
-          <w:sz w:val="18"/>
-          <w:szCs w:val="18"/>
-        </w:rPr>
-        <w:t>Whole numbers only. The sheet will not accept values outside the scale.</w:t>
-      </w:r>
-    </w:p>
-    <w:p>
-      <w:pPr>
-        <w:pStyle w:val="ListParagraph"/>
-        <w:numPr>
-          <w:ilvl w:val="0"/>
-          <w:numId w:val="2"/>
-        </w:numPr>
-        <w:spacing w:after="60"/>
-        <w:rPr>
-          <w:rFonts w:ascii="Arial" w:hAnsi="Arial" w:cs="Arial"/>
-          <w:sz w:val="18"/>
-          <w:szCs w:val="18"/>
-        </w:rPr>
-      </w:pPr>
-      <w:r>
-        <w:rPr>
-          <w:rFonts w:ascii="Arial" w:hAnsi="Arial" w:cs="Arial"/>
-          <w:sz w:val="18"/>
-          <w:szCs w:val="18"/>
-        </w:rPr>
-        <w:t xml:space="preserve">If you are unsure, still give your best score and type </w:t>
-      </w:r>
-      <w:r>
-        <w:rPr>
-          <w:rFonts w:ascii="Arial" w:hAnsi="Arial" w:cs="Arial"/>
-          <w:b/>
-          <w:bCs/>
-          <w:sz w:val="18"/>
-          <w:szCs w:val="18"/>
-        </w:rPr>
-        <w:t>Y</w:t>
-      </w:r>
-      <w:r>
-        <w:rPr>
-          <w:rFonts w:ascii="Arial" w:hAnsi="Arial" w:cs="Arial"/>
-          <w:sz w:val="18"/>
-          <w:szCs w:val="18"/>
-        </w:rPr>
-        <w:t xml:space="preserve"> under Unsure.</w:t>
-      </w:r>
-    </w:p>
-    <w:p>
-      <w:pPr>
-        <w:pStyle w:val="ListParagraph"/>
-        <w:numPr>
-          <w:ilvl w:val="0"/>
-          <w:numId w:val="2"/>
-        </w:numPr>
-        <w:spacing w:after="60"/>
-        <w:rPr>
-          <w:rFonts w:ascii="Arial" w:hAnsi="Arial" w:cs="Arial"/>
-          <w:sz w:val="18"/>
-          <w:szCs w:val="18"/>
-        </w:rPr>
-      </w:pPr>
-      <w:r>
-        <w:rPr>
-          <w:rFonts w:ascii="Arial" w:hAnsi="Arial" w:cs="Arial"/>
-          <w:sz w:val="18"/>
-          <w:szCs w:val="18"/>
-        </w:rPr>
-        <w:t>Save after each sitting and send the file back without renaming it.</w:t>
       </w:r>
     </w:p>
     <w:p>

</xml_diff>